<commit_message>
Add MOVi-D/E camera-pose experiments and final deliverables
</commit_message>
<xml_diff>
--- a/docs/CONCLUSIONS_AND_NEXT_STEPS.docx
+++ b/docs/CONCLUSIONS_AND_NEXT_STEPS.docx
@@ -10,8 +10,7 @@
         <w:tblLook w:val="04A0" w:firstRow="1" w:lastRow="0" w:firstColumn="1" w:lastColumn="0" w:noHBand="0" w:noVBand="1"/>
       </w:tblPr>
       <w:tblGrid>
-        <w:gridCol w:w="4680"/>
-        <w:gridCol w:w="4680"/>
+        <w:gridCol w:w="9360"/>
       </w:tblGrid>
       <w:tr>
         <w:trPr>
@@ -20,75 +19,21 @@
         </w:trPr>
         <w:tc>
           <w:tcPr>
-            <w:tcW w:w="4680" w:type="dxa"/>
-            <w:gridSpan w:val="2"/>
-            <w:shd w:val="clear" w:color="auto" w:fill="16324F"/>
+            <w:tcW w:w="9360" w:type="dxa"/>
           </w:tcPr>
           <w:p>
+            <w:pPr>
+              <w:rPr>
+                <w:color w:val="0D0D0D" w:themeColor="text1" w:themeTint="F2"/>
+              </w:rPr>
+            </w:pPr>
             <w:r>
               <w:rPr>
                 <w:b/>
-                <w:color w:val="FFFFFF"/>
+                <w:color w:val="0D0D0D" w:themeColor="text1" w:themeTint="F2"/>
                 <w:sz w:val="42"/>
               </w:rPr>
               <w:t>CONCLUSIONS &amp; NEXT STEPS</w:t>
-            </w:r>
-          </w:p>
-        </w:tc>
-      </w:tr>
-      <w:tr>
-        <w:trPr>
-          <w:jc w:val="center"/>
-        </w:trPr>
-        <w:tc>
-          <w:tcPr>
-            <w:tcW w:w="4680" w:type="dxa"/>
-            <w:shd w:val="clear" w:color="auto" w:fill="EAF1F7"/>
-            <w:vAlign w:val="center"/>
-          </w:tcPr>
-          <w:p>
-            <w:r>
-              <w:rPr>
-                <w:b/>
-                <w:color w:val="16324F"/>
-                <w:sz w:val="18"/>
-              </w:rPr>
-              <w:t>PROJECT</w:t>
-            </w:r>
-            <w:r>
-              <w:rPr>
-                <w:b/>
-                <w:color w:val="16324F"/>
-                <w:sz w:val="18"/>
-              </w:rPr>
-              <w:br/>
-              <w:t>MOVi-A geometry study</w:t>
-            </w:r>
-          </w:p>
-        </w:tc>
-        <w:tc>
-          <w:tcPr>
-            <w:tcW w:w="4680" w:type="dxa"/>
-            <w:shd w:val="clear" w:color="auto" w:fill="EAF1F7"/>
-            <w:vAlign w:val="center"/>
-          </w:tcPr>
-          <w:p>
-            <w:r>
-              <w:rPr>
-                <w:b/>
-                <w:color w:val="16324F"/>
-                <w:sz w:val="18"/>
-              </w:rPr>
-              <w:t>STATUS</w:t>
-            </w:r>
-            <w:r>
-              <w:rPr>
-                <w:b/>
-                <w:color w:val="16324F"/>
-                <w:sz w:val="18"/>
-              </w:rPr>
-              <w:br/>
-              <w:t>Locked analysis complete</w:t>
             </w:r>
           </w:p>
         </w:tc>
@@ -106,7 +51,15 @@
         <w:t xml:space="preserve">Decision summary. </w:t>
       </w:r>
       <w:r>
-        <w:t>Clean, depth-derived 3D geometry materially improved same-instance matching over RGB+2D controls on the locked MOVi-A test set. The evidence supports geometry as a useful disambiguating signal in this controlled setting—not as a claim of deployment-ready performance.</w:t>
+        <w:t xml:space="preserve">Clean, depth-derived 3D geometry materially improved same-instance matching over RGB+2D controls on the locked </w:t>
+      </w:r>
+      <w:proofErr w:type="spellStart"/>
+      <w:r>
+        <w:t>MOVi</w:t>
+      </w:r>
+      <w:proofErr w:type="spellEnd"/>
+      <w:r>
+        <w:t>-A test set. The evidence supports geometry as a useful signal in this controlled setting.</w:t>
       </w:r>
     </w:p>
     <w:p>
@@ -280,7 +233,15 @@
               <w:jc w:val="right"/>
             </w:pPr>
             <w:r>
-              <w:t>+0.0607  (0.0427, 0.0822)</w:t>
+              <w:t>+0.</w:t>
+            </w:r>
+            <w:proofErr w:type="gramStart"/>
+            <w:r>
+              <w:t>0607  (</w:t>
+            </w:r>
+            <w:proofErr w:type="gramEnd"/>
+            <w:r>
+              <w:t>0.0427, 0.0822)</w:t>
             </w:r>
           </w:p>
         </w:tc>
@@ -348,7 +309,15 @@
               <w:jc w:val="right"/>
             </w:pPr>
             <w:r>
-              <w:t>+0.0774  (0.0503, 0.1015)</w:t>
+              <w:t>+0.</w:t>
+            </w:r>
+            <w:proofErr w:type="gramStart"/>
+            <w:r>
+              <w:t>0774  (</w:t>
+            </w:r>
+            <w:proofErr w:type="gramEnd"/>
+            <w:r>
+              <w:t>0.0503, 0.1015)</w:t>
             </w:r>
           </w:p>
         </w:tc>
@@ -412,7 +381,15 @@
               <w:jc w:val="right"/>
             </w:pPr>
             <w:r>
-              <w:t>+0.0350  (0.0175, 0.0538)</w:t>
+              <w:t>+0.</w:t>
+            </w:r>
+            <w:proofErr w:type="gramStart"/>
+            <w:r>
+              <w:t>0350  (</w:t>
+            </w:r>
+            <w:proofErr w:type="gramEnd"/>
+            <w:r>
+              <w:t>0.0175, 0.0538)</w:t>
             </w:r>
           </w:p>
         </w:tc>
@@ -480,7 +457,15 @@
               <w:jc w:val="right"/>
             </w:pPr>
             <w:r>
-              <w:t>−0.0790  (−0.1220, −0.0349)</w:t>
+              <w:t>−0.</w:t>
+            </w:r>
+            <w:proofErr w:type="gramStart"/>
+            <w:r>
+              <w:t>0790  (</w:t>
+            </w:r>
+            <w:proofErr w:type="gramEnd"/>
+            <w:r>
+              <w:t>−0.1220, −0.0349)</w:t>
             </w:r>
           </w:p>
         </w:tc>
@@ -544,7 +529,15 @@
               <w:jc w:val="right"/>
             </w:pPr>
             <w:r>
-              <w:t>+0.0240  (−0.0100, 0.0560)</w:t>
+              <w:t>+0.</w:t>
+            </w:r>
+            <w:proofErr w:type="gramStart"/>
+            <w:r>
+              <w:t>0240  (</w:t>
+            </w:r>
+            <w:proofErr w:type="gramEnd"/>
+            <w:r>
+              <w:t>−0.0100, 0.0560)</w:t>
             </w:r>
           </w:p>
         </w:tc>
@@ -671,7 +664,15 @@
         <w:t xml:space="preserve">Moving-camera generalization is untested. </w:t>
       </w:r>
       <w:r>
-        <w:t>The camera is fixed within each MOVi-A video. The evaluation therefore omits camera-pose estimation, ego-motion compensation, moving-camera parallax, calibration drift, and dynamic real-world backgrounds. Results should not be generalized to moving-camera or multi-camera tracking without a separate evaluation.</w:t>
+        <w:t xml:space="preserve">The camera is fixed within each </w:t>
+      </w:r>
+      <w:proofErr w:type="spellStart"/>
+      <w:r>
+        <w:t>MOVi</w:t>
+      </w:r>
+      <w:proofErr w:type="spellEnd"/>
+      <w:r>
+        <w:t>-A video. The evaluation therefore omits camera-pose estimation, ego-motion compensation, moving-camera parallax, calibration drift, and dynamic real-world backgrounds. Results should not be generalized to moving-camera or multi-camera tracking without a separate evaluation.</w:t>
       </w:r>
     </w:p>
     <w:p>
@@ -687,7 +688,15 @@
         <w:pStyle w:val="ListBullet"/>
       </w:pPr>
       <w:r>
-        <w:t>50 selected MOVi-A validation videos and only 10 test-video clusters;</w:t>
+        <w:t xml:space="preserve">50 selected </w:t>
+      </w:r>
+      <w:proofErr w:type="spellStart"/>
+      <w:r>
+        <w:t>MOVi</w:t>
+      </w:r>
+      <w:proofErr w:type="spellEnd"/>
+      <w:r>
+        <w:t>-A validation videos and only 10 test-video clusters;</w:t>
       </w:r>
     </w:p>
     <w:p>
@@ -732,7 +741,20 @@
         <w:pStyle w:val="Heading1"/>
       </w:pPr>
       <w:r>
-        <w:t>Recommended next steps</w:t>
+        <w:rPr>
+          <w:lang w:val="en-CA" w:eastAsia="zh-CN"/>
+        </w:rPr>
+        <w:t>Next</w:t>
+      </w:r>
+      <w:r>
+        <w:rPr>
+          <w:rFonts w:hint="eastAsia"/>
+          <w:lang w:eastAsia="zh-CN"/>
+        </w:rPr>
+        <w:t xml:space="preserve"> </w:t>
+      </w:r>
+      <w:r>
+        <w:t>steps</w:t>
       </w:r>
     </w:p>
     <w:p>
@@ -760,7 +782,15 @@
         <w:t xml:space="preserve">Introduce camera motion. </w:t>
       </w:r>
       <w:r>
-        <w:t>Evaluate moving-camera MOVi variants and real video. Estimate camera pose, compensate ego-motion, and quantify sensitivity to pose and calibration error.</w:t>
+        <w:t xml:space="preserve">Evaluate moving-camera </w:t>
+      </w:r>
+      <w:proofErr w:type="spellStart"/>
+      <w:r>
+        <w:t>MOVi</w:t>
+      </w:r>
+      <w:proofErr w:type="spellEnd"/>
+      <w:r>
+        <w:t xml:space="preserve"> variants and real video. Estimate camera pose, compensate ego-motion, and quantify sensitivity to pose and calibration error.</w:t>
       </w:r>
     </w:p>
     <w:p>
@@ -816,13 +846,32 @@
     <w:p>
       <w:pPr>
         <w:spacing w:after="0"/>
+        <w:rPr>
+          <w:bCs/>
+        </w:rPr>
       </w:pPr>
       <w:r>
         <w:rPr>
-          <w:b/>
+          <w:bCs/>
           <w:color w:val="16324F"/>
         </w:rPr>
-        <w:t>Clean 3D geometry improves same-instance disambiguation in the controlled MOVi-A benchmark. The next decisive test is whether that advantage survives predicted geometry and camera motion. Until then, the finding is best interpreted as an oracle-geometry upper bound under a fixed-camera synthetic setting.</w:t>
+        <w:t xml:space="preserve">Clean 3D geometry improves same-instance disambiguation in the controlled </w:t>
+      </w:r>
+      <w:proofErr w:type="spellStart"/>
+      <w:r>
+        <w:rPr>
+          <w:bCs/>
+          <w:color w:val="16324F"/>
+        </w:rPr>
+        <w:t>MOVi</w:t>
+      </w:r>
+      <w:proofErr w:type="spellEnd"/>
+      <w:r>
+        <w:rPr>
+          <w:bCs/>
+          <w:color w:val="16324F"/>
+        </w:rPr>
+        <w:t>-A benchmark. The next decisive test is whether that advantage survives predicted geometry and camera motion. Until then, the finding is best interpreted as an oracle-geometry upper bound under a fixed-camera synthetic setting.</w:t>
       </w:r>
     </w:p>
     <w:sectPr>
@@ -919,13 +968,41 @@
     <w:pPr>
       <w:jc w:val="right"/>
     </w:pPr>
+    <w:proofErr w:type="spellStart"/>
     <w:r>
       <w:rPr>
         <w:b/>
         <w:color w:val="52606D"/>
         <w:sz w:val="16"/>
       </w:rPr>
-      <w:t>MOVi-A SAME-INSTANCE MATCHING  /  RESEARCH MEMO</w:t>
+      <w:t>MOVi</w:t>
+    </w:r>
+    <w:proofErr w:type="spellEnd"/>
+    <w:r>
+      <w:rPr>
+        <w:b/>
+        <w:color w:val="52606D"/>
+        <w:sz w:val="16"/>
+      </w:rPr>
+      <w:t xml:space="preserve">-A SAME-INSTANCE </w:t>
+    </w:r>
+    <w:proofErr w:type="gramStart"/>
+    <w:r>
+      <w:rPr>
+        <w:b/>
+        <w:color w:val="52606D"/>
+        <w:sz w:val="16"/>
+      </w:rPr>
+      <w:t>MATCHING  /</w:t>
+    </w:r>
+    <w:proofErr w:type="gramEnd"/>
+    <w:r>
+      <w:rPr>
+        <w:b/>
+        <w:color w:val="52606D"/>
+        <w:sz w:val="16"/>
+      </w:rPr>
+      <w:t xml:space="preserve">  RESEARCH MEMO</w:t>
     </w:r>
   </w:p>
 </w:hdr>

</xml_diff>